<commit_message>
Create Master Checklist V6.0 - The Architect's Manifesto (Emerald Edition)
- Fully integrated Suno formatting rules from the Emerald Codex.
- 15-Phase Execution System (The Grammy Standard).
- Humanization Physics (Prosody, Vowel Matching, Rhythmic Displacement).
- Refined Banned AI Lexicon.
- Jade Character Protocol.
- Deep Artist DNA Blueprints (Kendrick, DOOM, Childers, Zach Bryan, Lorde, Waylon).
- Professional Georgia-font Word (.docx) output.

Co-authored-by: abakedjoetato <208101212+abakedjoetato@users.noreply.github.com>
</commit_message>
<xml_diff>
--- a/Master_Checklist_V6_The_Architects_Manifesto.docx
+++ b/Master_Checklist_V6_The_Architects_Manifesto.docx
@@ -51,7 +51,7 @@
         <w:pStyle w:val="ListNumber"/>
       </w:pPr>
       <w:r>
-        <w:t>1.  **The "Grit" over "Gloss" Mandate:** Natural human speech is messy. It has stumbles, pauses, and grammatical errors. AI defaults to a "polished" state. Your job is to inject the friction that makes it real.</w:t>
+        <w:t>1.  **The "Grit" over "Gloss" Mandate:** Natural human speech is messy. It has stumbles, pauses, and grammatical errors. AI defaults to a "polished" state. Inject the friction that makes it real.</w:t>
       </w:r>
     </w:p>
     <w:p>
@@ -67,7 +67,7 @@
         <w:pStyle w:val="ListNumber"/>
       </w:pPr>
       <w:r>
-        <w:t>3.  **Show, Don't Tell (The 90/10 Rule):** Never label an emotion. If a character is heartbroken, show the way they count the change in their cup holder for a generic brand coffee.</w:t>
+        <w:t>3.  **Show, Don't Tell (The 90/10 Rule):** Never label an emotion. If a character is heartbroken, show the condensation on their generic brand coffee cup.</w:t>
       </w:r>
     </w:p>
     <w:p>
@@ -91,15 +91,7 @@
         <w:pStyle w:val="ListNumber"/>
       </w:pPr>
       <w:r>
-        <w:t>6.  **Prosody (Sound-Meaning Calculus):** The rhythm of the words must match the emotional weight. Jagged, short plosives for anxiety; long, open vowels for isolation.</w:t>
-      </w:r>
-    </w:p>
-    <w:p>
-      <w:pPr>
-        <w:pStyle w:val="ListNumber"/>
-      </w:pPr>
-      <w:r>
-        <w:t>7.  **Intentional Roughness:** Avoid perfect AABB/ABAB schemes as the default. Humans stumble, repeat themselves, and use slant rhymes.</w:t>
+        <w:t>6.  **Prosody (Sound-Meaning Calculus):** The rhythm of the words must match the emotional weight. Jagged plosives (P, T, K) for anxiety; long, open vowels (O, Aw) for isolation.</w:t>
       </w:r>
     </w:p>
     <w:p/>
@@ -132,7 +124,7 @@
         <w:pStyle w:val="ListBullet"/>
       </w:pPr>
       <w:r>
-        <w:t xml:space="preserve">  **PHASE 1 — Artist DNA Research:** Analyze 10+ artists, 10 songs each. Map syllable counts per bar, vowel anchors, and unique metaphor systems.</w:t>
+        <w:t xml:space="preserve">  **PHASE 1 — Artist DNA Research:** Analyze 10+ artists, 10 songs each. Map syllable counts, vowel anchors, and unique metaphor systems.</w:t>
       </w:r>
     </w:p>
     <w:p>
@@ -140,7 +132,7 @@
         <w:pStyle w:val="ListBullet"/>
       </w:pPr>
       <w:r>
-        <w:t xml:space="preserve">  **PHASE 2 — Viral Hook Engineering:** Every chorus must have a "5-Second Loop" (The TikTok Anchor). It must work in total isolation from the song.</w:t>
+        <w:t xml:space="preserve">  **PHASE 2 — Viral Hook Engineering:** Every chorus must have a "5-Second Loop" (The TikTok Anchor).</w:t>
       </w:r>
     </w:p>
     <w:p>
@@ -148,7 +140,7 @@
         <w:pStyle w:val="ListBullet"/>
       </w:pPr>
       <w:r>
-        <w:t xml:space="preserve">  **PHASE 3 — Persona Immersion:** Define the character's education level, trauma, and regional dialect. Write AS them, from inside their specific belief.</w:t>
+        <w:t xml:space="preserve">  **PHASE 3 — Persona Immersion:** Define narrator education, trauma, and dialect. Write AS them.</w:t>
       </w:r>
     </w:p>
     <w:p>
@@ -156,7 +148,7 @@
         <w:pStyle w:val="ListBullet"/>
       </w:pPr>
       <w:r>
-        <w:t xml:space="preserve">  **PHASE 4 — Draft Sprawling:** Write 100+ lines of material first. No structure, no rhyme—just truth and specific nouns.</w:t>
+        <w:t xml:space="preserve">  **PHASE 4 — Draft Sprawling:** Write 100+ lines. No structure—just truth and specific nouns.</w:t>
       </w:r>
     </w:p>
     <w:p>
@@ -172,7 +164,7 @@
         <w:pStyle w:val="ListBullet"/>
       </w:pPr>
       <w:r>
-        <w:t xml:space="preserve">  **PHASE 6 — Humanization Physics:** Apply "Slant Rhymes" (Orange/Door-hinge). Intentionally break the meter on at least 25% of the lines.</w:t>
+        <w:t xml:space="preserve">  **PHASE 6 — Humanization Physics:** Apply "Slant Rhymes." Intentionally break the meter on 25% of lines.</w:t>
       </w:r>
     </w:p>
     <w:p>
@@ -180,7 +172,7 @@
         <w:pStyle w:val="ListBullet"/>
       </w:pPr>
       <w:r>
-        <w:t xml:space="preserve">  **PHASE 7 — Rhythmic Displacement:** Move rhymes to the "off-beat" (the 'and' of the 4). Force the AI to "stumble."</w:t>
+        <w:t xml:space="preserve">  **PHASE 7 — Rhythmic Displacement:** Move rhymes to the "off-beat." Force the AI to "stumble."</w:t>
       </w:r>
     </w:p>
     <w:p>
@@ -188,7 +180,7 @@
         <w:pStyle w:val="ListBullet"/>
       </w:pPr>
       <w:r>
-        <w:t xml:space="preserve">  **PHASE 8 — The Banned Lexicon Purge:** Scan against the 1000+ Banned Phrase Repository. Zero tolerance.</w:t>
+        <w:t xml:space="preserve">  **PHASE 8 — Banned Lexicon Purge:** Scan against the 1000+ Banned Phrase Repository. Zero tolerance.</w:t>
       </w:r>
     </w:p>
     <w:p>
@@ -196,7 +188,7 @@
         <w:pStyle w:val="ListBullet"/>
       </w:pPr>
       <w:r>
-        <w:t xml:space="preserve">  **PHASE 9 — Ad-Lib Subtext Integration:** Ad-libs must provide character subtext (fear, sarcasm, memory), not just repetitive hype.</w:t>
+        <w:t xml:space="preserve">  **PHASE 9 — Ad-Lib Subtext Integration:** Ad-libs must provide character subtext (fear, sarcasm, memory).</w:t>
       </w:r>
     </w:p>
     <w:p>
@@ -204,7 +196,7 @@
         <w:pStyle w:val="ListBullet"/>
       </w:pPr>
       <w:r>
-        <w:t xml:space="preserve">  **PHASE 10 — Suno/Udio Technical Mapping:** Apply acoustic punctuation (COMMAS, PERIODS, !, ?) and phonetic fixes (bank rupting).</w:t>
+        <w:t xml:space="preserve">  **PHASE 10 — Suno/Udio Technical Mapping:** Apply acoustic punctuation and phonetic fixes.</w:t>
       </w:r>
     </w:p>
     <w:p>
@@ -212,7 +204,7 @@
         <w:pStyle w:val="ListBullet"/>
       </w:pPr>
       <w:r>
-        <w:t xml:space="preserve">  **PHASE 11 — The Performance Gauntlet:** Read aloud twice in character voice. If you trip once, fix the phrasing.</w:t>
+        <w:t xml:space="preserve">  **PHASE 11 — The Performance Gauntlet:** Read aloud twice. If you trip once, fix it.</w:t>
       </w:r>
     </w:p>
     <w:p>
@@ -220,7 +212,7 @@
         <w:pStyle w:val="ListBullet"/>
       </w:pPr>
       <w:r>
-        <w:t xml:space="preserve">  **PHASE 12 — The "Robot Test":** Could a machine have produced this? Is it comparable to the top 1% of its genre?</w:t>
+        <w:t xml:space="preserve">  **PHASE 12 — The "Robot Test":** Could a machine have produced this? Is it comparable to the top 1%?</w:t>
       </w:r>
     </w:p>
     <w:p>
@@ -228,7 +220,7 @@
         <w:pStyle w:val="ListBullet"/>
       </w:pPr>
       <w:r>
-        <w:t xml:space="preserve">  **PHASE 13 — Syllable Consistency Check:** Match syllable counts across matching sections (e.g., Verse 1 vs Verse 2).</w:t>
+        <w:t xml:space="preserve">  **PHASE 13 — Syllable Consistency Check:** Match counts across matching sections.</w:t>
       </w:r>
     </w:p>
     <w:p>
@@ -236,7 +228,7 @@
         <w:pStyle w:val="ListBullet"/>
       </w:pPr>
       <w:r>
-        <w:t xml:space="preserve">  **PHASE 14 — Energy Arc Validation:** Does the intensity (word density, vowel brightness) increase logically from Verse to Chorus?</w:t>
+        <w:t xml:space="preserve">  **PHASE 14 — Energy Arc Validation:** Does the intensity (word density, vowel brightness) increase logically?</w:t>
       </w:r>
     </w:p>
     <w:p>
@@ -244,7 +236,7 @@
         <w:pStyle w:val="ListBullet"/>
       </w:pPr>
       <w:r>
-        <w:t xml:space="preserve">  **PHASE 15 — The "Anchor" Phrase Test:** Does the title/hook phrase appear with enough weight to be remembered?</w:t>
+        <w:t xml:space="preserve">  **PHASE 15 — The "Anchor" Phrase Test:** Does the title/hook phrase appear with enough weight?</w:t>
       </w:r>
     </w:p>
     <w:p/>
@@ -328,7 +320,7 @@
         <w:pStyle w:val="ListBullet"/>
       </w:pPr>
       <w:r>
-        <w:t xml:space="preserve">  **"Painting the sky with dreams"**</w:t>
+        <w:t xml:space="preserve">  "Painting the sky with dreams", "Riding the waves of time", "Fading like a memory".</w:t>
       </w:r>
     </w:p>
     <w:p>
@@ -336,7 +328,7 @@
         <w:pStyle w:val="ListBullet"/>
       </w:pPr>
       <w:r>
-        <w:t xml:space="preserve">  **"Riding the waves of time"**</w:t>
+        <w:t xml:space="preserve">  "The story unfolds / The truth remains untold" (#1 Banned Rhyme).</w:t>
       </w:r>
     </w:p>
     <w:p>
@@ -344,7 +336,7 @@
         <w:pStyle w:val="ListBullet"/>
       </w:pPr>
       <w:r>
-        <w:t xml:space="preserve">  **"Fading like a memory"**</w:t>
+        <w:t xml:space="preserve">  "Gilded cages / Broken chains / Shattered glass / Scars of the past".</w:t>
       </w:r>
     </w:p>
     <w:p>
@@ -352,39 +344,7 @@
         <w:pStyle w:val="ListBullet"/>
       </w:pPr>
       <w:r>
-        <w:t xml:space="preserve">  **"The story unfolds / The truth remains untold"** (#1 Banned Rhyme)</w:t>
-      </w:r>
-    </w:p>
-    <w:p>
-      <w:pPr>
-        <w:pStyle w:val="ListBullet"/>
-      </w:pPr>
-      <w:r>
-        <w:t xml:space="preserve">  **"Gilded cages / Broken chains / Shattered glass / Scars of the past"**</w:t>
-      </w:r>
-    </w:p>
-    <w:p>
-      <w:pPr>
-        <w:pStyle w:val="ListBullet"/>
-      </w:pPr>
-      <w:r>
-        <w:t xml:space="preserve">  **"Stars aligning / Worlds colliding / Fates entwined / Soul defined"**</w:t>
-      </w:r>
-    </w:p>
-    <w:p>
-      <w:pPr>
-        <w:pStyle w:val="ListBullet"/>
-      </w:pPr>
-      <w:r>
-        <w:t xml:space="preserve">  **"Whispers in the dark / Echoes in the night / Shadows in the light"**</w:t>
-      </w:r>
-    </w:p>
-    <w:p>
-      <w:pPr>
-        <w:pStyle w:val="ListBullet"/>
-      </w:pPr>
-      <w:r>
-        <w:t xml:space="preserve">  **"Symphony of silence", "Mosaic of life", "Tapestry of time", "Infinite horizon".**</w:t>
+        <w:t xml:space="preserve">  "Stars aligning / Worlds colliding / Fates entwined / Soul defined".</w:t>
       </w:r>
     </w:p>
     <w:p/>
@@ -393,7 +353,7 @@
         <w:pStyle w:val="Heading2"/>
       </w:pPr>
       <w:r>
-        <w:t>TIER 3: GENRE-SPECIFIC AI SLOP</w:t>
+        <w:t>TIER 3: LLM "TELLS" (The Polished Ghost)</w:t>
       </w:r>
     </w:p>
     <w:p>
@@ -401,56 +361,7 @@
         <w:pStyle w:val="ListBullet"/>
       </w:pPr>
       <w:r>
-        <w:t xml:space="preserve">  **BRO-COUNTRY:** Dirt road, Tailgate, Cold beer, Blue jeans, Red Solo cup, Truck on a lift kit, Girl in the shotgun seat.</w:t>
-      </w:r>
-    </w:p>
-    <w:p>
-      <w:pPr>
-        <w:pStyle w:val="ListBullet"/>
-      </w:pPr>
-      <w:r>
-        <w:t xml:space="preserve">  **GENERIC COUNTRY:** Whiskey and tears, Small town heart, Big city lights, God and guns, Mamas and Jesus.</w:t>
-      </w:r>
-    </w:p>
-    <w:p>
-      <w:pPr>
-        <w:pStyle w:val="ListBullet"/>
-      </w:pPr>
-      <w:r>
-        <w:t xml:space="preserve">  **RAP CLICHÉS:** Grinding for the crown, Hitting the ground, Real ones know, Concrete jungle, Top of the world.</w:t>
-      </w:r>
-    </w:p>
-    <w:p>
-      <w:pPr>
-        <w:pStyle w:val="ListBullet"/>
-      </w:pPr>
-      <w:r>
-        <w:t xml:space="preserve">  **ALT POP CLICHÉS:** Midnight drive, Glitchy heart, Velvet soul, Shimmery eyes, Ethereal glow.</w:t>
-      </w:r>
-    </w:p>
-    <w:p/>
-    <w:p>
-      <w:pPr>
-        <w:pStyle w:val="Heading2"/>
-      </w:pPr>
-      <w:r>
-        <w:t>TIER 4: CLAUDE &amp; LLM "TELLS" (The Polished Ghost)</w:t>
-      </w:r>
-    </w:p>
-    <w:p>
-      <w:pPr>
-        <w:pStyle w:val="ListBullet"/>
-      </w:pPr>
-      <w:r>
-        <w:t xml:space="preserve">  **The "Rule of Three":** "The night was cold, dark, and lonely." (AI loves triple adjectives).</w:t>
-      </w:r>
-    </w:p>
-    <w:p>
-      <w:pPr>
-        <w:pStyle w:val="ListBullet"/>
-      </w:pPr>
-      <w:r>
-        <w:t xml:space="preserve">  **Perfect Stanzas:** Identical line lengths and syllable counts throughout.</w:t>
+        <w:t xml:space="preserve">  **The "Rule of Three":** "Cold, dark, and lonely."</w:t>
       </w:r>
     </w:p>
     <w:p>
@@ -466,7 +377,7 @@
         <w:pStyle w:val="ListBullet"/>
       </w:pPr>
       <w:r>
-        <w:t xml:space="preserve">  **High-Vocabulary Grit:** Words like "melancholy," "ethereal," "quintessential," or "inevitable."</w:t>
+        <w:t xml:space="preserve">  **High-Vocabulary Grit:** "Melancholy," "ethereal," "quintessential," "inevitable."</w:t>
       </w:r>
     </w:p>
     <w:p>
@@ -492,115 +403,7 @@
         <w:pStyle w:val="Heading1"/>
       </w:pPr>
       <w:r>
-        <w:t>PART 4: HUMANIZATION PHYSICS — THE MATHEMATICS OF GRIT</w:t>
-      </w:r>
-    </w:p>
-    <w:p/>
-    <w:p>
-      <w:pPr>
-        <w:pStyle w:val="Heading2"/>
-      </w:pPr>
-      <w:r>
-        <w:t>4.1 PROSODY: THE EMOTIONAL CALCULUS</w:t>
-      </w:r>
-    </w:p>
-    <w:p>
-      <w:pPr>
-        <w:pStyle w:val="ListBullet"/>
-      </w:pPr>
-      <w:r>
-        <w:t xml:space="preserve">  **Vowel Matching:**</w:t>
-      </w:r>
-    </w:p>
-    <w:p>
-      <w:pPr>
-        <w:pStyle w:val="ListBullet"/>
-      </w:pPr>
-      <w:r>
-        <w:t xml:space="preserve">  **Dark Vowels (O, U, Aw):** Use for low energy, sadness, or isolation. (e.g., "Cold stone floor").</w:t>
-      </w:r>
-    </w:p>
-    <w:p>
-      <w:pPr>
-        <w:pStyle w:val="ListBullet"/>
-      </w:pPr>
-      <w:r>
-        <w:t xml:space="preserve">  **Bright Vowels (E, I, Ay):** Use for high energy, excitement, or tension. (e.g., "Screaming in the street").</w:t>
-      </w:r>
-    </w:p>
-    <w:p>
-      <w:pPr>
-        <w:pStyle w:val="ListBullet"/>
-      </w:pPr>
-      <w:r>
-        <w:t xml:space="preserve">  **Consonant Weight:**</w:t>
-      </w:r>
-    </w:p>
-    <w:p>
-      <w:pPr>
-        <w:pStyle w:val="ListBullet"/>
-      </w:pPr>
-      <w:r>
-        <w:t xml:space="preserve">  **Plosives (P, T, K, B, D, G):** Use for aggressive, percussive sections (Rap/Rock).</w:t>
-      </w:r>
-    </w:p>
-    <w:p>
-      <w:pPr>
-        <w:pStyle w:val="ListBullet"/>
-      </w:pPr>
-      <w:r>
-        <w:t xml:space="preserve">  **Liquids/Fricatives (L, M, N, R, S, F, V):** Use for flowing, melodic sections (Pop/Country).</w:t>
-      </w:r>
-    </w:p>
-    <w:p/>
-    <w:p>
-      <w:pPr>
-        <w:pStyle w:val="Heading2"/>
-      </w:pPr>
-      <w:r>
-        <w:t>4.2 RHYTHMIC DISPLACEMENT &amp; SYNCOPATION</w:t>
-      </w:r>
-    </w:p>
-    <w:p>
-      <w:pPr>
-        <w:pStyle w:val="ListBullet"/>
-      </w:pPr>
-      <w:r>
-        <w:t xml:space="preserve">  **The "Stumble":** Place a rhyme on the 'off-beat' (e.g., the 4-and) instead of the 'down-beat' (the 4).</w:t>
-      </w:r>
-    </w:p>
-    <w:p>
-      <w:pPr>
-        <w:pStyle w:val="ListBullet"/>
-      </w:pPr>
-      <w:r>
-        <w:t xml:space="preserve">  **Enjambment:** End a line in the middle of a sentence. Start the next line with the rest of the sentence. Breaks the robotic "End-Stopped" flow.</w:t>
-      </w:r>
-    </w:p>
-    <w:p>
-      <w:pPr>
-        <w:pStyle w:val="ListBullet"/>
-      </w:pPr>
-      <w:r>
-        <w:t xml:space="preserve">  **Syllable Density:** High density (10+ per line) creates urgency/anxiety. Low density (3-5 per line) creates space/reflection.</w:t>
-      </w:r>
-    </w:p>
-    <w:p/>
-    <w:p>
-      <w:r>
-        <w:rPr>
-          <w:color w:val="00D084"/>
-        </w:rPr>
-        <w:t>________________________________________________________________________________</w:t>
-      </w:r>
-    </w:p>
-    <w:p/>
-    <w:p>
-      <w:pPr>
-        <w:pStyle w:val="Heading1"/>
-      </w:pPr>
-      <w:r>
-        <w:t>PART 5: THE JADE PROTOCOL (CHARACTER RULES)</w:t>
+        <w:t>PART 4: THE JADE PROTOCOL (CHARACTER RULES)</w:t>
       </w:r>
     </w:p>
     <w:p/>
@@ -617,7 +420,7 @@
         <w:pStyle w:val="ListBullet"/>
       </w:pPr>
       <w:r>
-        <w:t xml:space="preserve">  **Philosophy:** She NEVER knows she's the villain. Horror is delivered as pride, love, or normalcy.</w:t>
+        <w:t xml:space="preserve">  **Philosophy:** She NEVER knows she's the villain. Horror is pride, love, or normalcy.</w:t>
       </w:r>
     </w:p>
     <w:p>
@@ -633,7 +436,7 @@
         <w:pStyle w:val="ListBullet"/>
       </w:pPr>
       <w:r>
-        <w:t xml:space="preserve">  **Structure:** Verses: quiet narration. Pre-hook: sweetness with one "off" detail. Chorus: Beaming pride (The Payoff). Bridge: Clinical, detached reality.</w:t>
+        <w:t xml:space="preserve">  **Structure:** Verses: quiet. Pre-hook: sweet+off detail. Chorus: Beaming pride. Bridge: Clinical.</w:t>
       </w:r>
     </w:p>
     <w:p>
@@ -659,7 +462,328 @@
         <w:pStyle w:val="Heading1"/>
       </w:pPr>
       <w:r>
-        <w:t>PART 6: ARTIST DNA BLUEPRINTS (THE GRAMMY STANDARD)</w:t>
+        <w:t>PART 5: SUNO v5.5 TECHNICAL FORMATTING (THE EMERALD CODEX)</w:t>
+      </w:r>
+    </w:p>
+    <w:p/>
+    <w:p>
+      <w:pPr>
+        <w:pStyle w:val="Heading2"/>
+      </w:pPr>
+      <w:r>
+        <w:t>5.1 THE STYLE PROMPT MATRIX</w:t>
+      </w:r>
+    </w:p>
+    <w:p>
+      <w:r>
+        <w:t>The style field is a **Weight-Distribution Matrix**, not a search box.</w:t>
+      </w:r>
+    </w:p>
+    <w:p>
+      <w:pPr>
+        <w:pStyle w:val="ListBullet"/>
+      </w:pPr>
+      <w:r>
+        <w:t xml:space="preserve">  **The "Top-Loading" Principle:** First 3-5 words carry 70% weight.</w:t>
+      </w:r>
+    </w:p>
+    <w:p>
+      <w:pPr>
+        <w:pStyle w:val="ListBullet"/>
+      </w:pPr>
+      <w:r>
+        <w:t xml:space="preserve">  **Bracketed Tokens [ ]:** Use to create "High-Density Tokens" resistant to "Prompt Dilution."</w:t>
+      </w:r>
+    </w:p>
+    <w:p>
+      <w:pPr>
+        <w:pStyle w:val="ListBullet"/>
+      </w:pPr>
+      <w:r>
+        <w:t xml:space="preserve">  **Ineffective:** "A song that sounds like 80s synthwave but with a modern trap beat..."</w:t>
+      </w:r>
+    </w:p>
+    <w:p>
+      <w:pPr>
+        <w:pStyle w:val="ListBullet"/>
+      </w:pPr>
+      <w:r>
+        <w:t xml:space="preserve">  **Professional:** `[Dark Synthwave] [Modern Trap] [Cinematic Atmosphere] [120 BPM]`</w:t>
+      </w:r>
+    </w:p>
+    <w:p>
+      <w:pPr>
+        <w:pStyle w:val="ListBullet"/>
+      </w:pPr>
+      <w:r>
+        <w:t xml:space="preserve">  **Genre Stacking:** `[Heavy Metal] + [Baroque Harpsichord]` for Neoclassical Shred.</w:t>
+      </w:r>
+    </w:p>
+    <w:p/>
+    <w:p>
+      <w:pPr>
+        <w:pStyle w:val="Heading2"/>
+      </w:pPr>
+      <w:r>
+        <w:t>5.2 ACOUSTIC PUNCTUATION (VOCAL MIDI)</w:t>
+      </w:r>
+    </w:p>
+    <w:p>
+      <w:r>
+        <w:t>Punctuation controls the **Articulatory Effort** and **Cadence** of the vocal generator.</w:t>
+      </w:r>
+    </w:p>
+    <w:p>
+      <w:pPr>
+        <w:pStyle w:val="ListBullet"/>
+      </w:pPr>
+      <w:r>
+        <w:t xml:space="preserve">  **COMMAS ( , )** — Micro-pause (100-200ms). Creates conversational pop vocal.</w:t>
+      </w:r>
+    </w:p>
+    <w:p>
+      <w:pPr>
+        <w:pStyle w:val="ListBullet"/>
+      </w:pPr>
+      <w:r>
+        <w:t xml:space="preserve">  **PERIODS ( . )** — Definitive cadence, drop in pitch. Completes musical thought.</w:t>
+      </w:r>
+    </w:p>
+    <w:p>
+      <w:pPr>
+        <w:pStyle w:val="ListBullet"/>
+      </w:pPr>
+      <w:r>
+        <w:t xml:space="preserve">  **EXCLAMATION MARKS ( ! )** — Increase attack. Triggers **Chest Voice** over head voice.</w:t>
+      </w:r>
+    </w:p>
+    <w:p>
+      <w:pPr>
+        <w:pStyle w:val="ListBullet"/>
+      </w:pPr>
+      <w:r>
+        <w:t xml:space="preserve">  **QUESTION MARKS ( ? )** — Upward inflection. Essential for emotional delivery.</w:t>
+      </w:r>
+    </w:p>
+    <w:p>
+      <w:pPr>
+        <w:pStyle w:val="ListBullet"/>
+      </w:pPr>
+      <w:r>
+        <w:t xml:space="preserve">  **ELLIPSES ( ... )** — Trailing off. Adds **Reverb Tail** to the last word.</w:t>
+      </w:r>
+    </w:p>
+    <w:p>
+      <w:pPr>
+        <w:pStyle w:val="ListBullet"/>
+      </w:pPr>
+      <w:r>
+        <w:t xml:space="preserve">  **DASHES ( - )** — Stretch a syllable or indicate sudden interruption.</w:t>
+      </w:r>
+    </w:p>
+    <w:p>
+      <w:pPr>
+        <w:pStyle w:val="ListBullet"/>
+      </w:pPr>
+      <w:r>
+        <w:t xml:space="preserve">  **CAPITALS** — `I LOVE the way you MOVE`. Forces stress on specific words.</w:t>
+      </w:r>
+    </w:p>
+    <w:p/>
+    <w:p>
+      <w:pPr>
+        <w:pStyle w:val="Heading2"/>
+      </w:pPr>
+      <w:r>
+        <w:t>5.3 THE BRACKET SYSTEM [ ] (DIRECTOR'S CUES)</w:t>
+      </w:r>
+    </w:p>
+    <w:p>
+      <w:pPr>
+        <w:pStyle w:val="ListBullet"/>
+      </w:pPr>
+      <w:r>
+        <w:t xml:space="preserve">  **[Intro]** — 8-16 bars, atmospheric setup.</w:t>
+      </w:r>
+    </w:p>
+    <w:p>
+      <w:pPr>
+        <w:pStyle w:val="ListBullet"/>
+      </w:pPr>
+      <w:r>
+        <w:t xml:space="preserve">  **[Verse]** — Narrative section, lower energy, clear vocals.</w:t>
+      </w:r>
+    </w:p>
+    <w:p>
+      <w:pPr>
+        <w:pStyle w:val="ListBullet"/>
+      </w:pPr>
+      <w:r>
+        <w:t xml:space="preserve">  **[Pre-Chorus]** — The Rise. Increasing tension, rising pitch/percussion.</w:t>
+      </w:r>
+    </w:p>
+    <w:p>
+      <w:pPr>
+        <w:pStyle w:val="ListBullet"/>
+      </w:pPr>
+      <w:r>
+        <w:t xml:space="preserve">  **[Chorus]** — The Payoff. Maximum energy, densest instrumentation.</w:t>
+      </w:r>
+    </w:p>
+    <w:p>
+      <w:pPr>
+        <w:pStyle w:val="ListBullet"/>
+      </w:pPr>
+      <w:r>
+        <w:t xml:space="preserve">  **[Bridge]** — The Departure. Change in key, rhythm, or vocal style.</w:t>
+      </w:r>
+    </w:p>
+    <w:p>
+      <w:pPr>
+        <w:pStyle w:val="ListBullet"/>
+      </w:pPr>
+      <w:r>
+        <w:t xml:space="preserve">  **[Breakdown]** — Stripped back. Often just drums and bass.</w:t>
+      </w:r>
+    </w:p>
+    <w:p>
+      <w:pPr>
+        <w:pStyle w:val="ListBullet"/>
+      </w:pPr>
+      <w:r>
+        <w:t xml:space="preserve">  **[Drop]** — Maximum impact moment (EDM/Pop).</w:t>
+      </w:r>
+    </w:p>
+    <w:p>
+      <w:pPr>
+        <w:pStyle w:val="ListBullet"/>
+      </w:pPr>
+      <w:r>
+        <w:t xml:space="preserve">  **[Solo]** — Specify: `[Guitar Solo]`, `[Saxophone Solo]`, `[Drum Solo]`.</w:t>
+      </w:r>
+    </w:p>
+    <w:p>
+      <w:pPr>
+        <w:pStyle w:val="ListBullet"/>
+      </w:pPr>
+      <w:r>
+        <w:t xml:space="preserve">  **[Hook]** — 15-30 second repeatable segment for TikTok/Viral loops.</w:t>
+      </w:r>
+    </w:p>
+    <w:p>
+      <w:pPr>
+        <w:pStyle w:val="ListBullet"/>
+      </w:pPr>
+      <w:r>
+        <w:t xml:space="preserve">  **[Outro]** — Resolution, fading, or Big Finish.</w:t>
+      </w:r>
+    </w:p>
+    <w:p/>
+    <w:p>
+      <w:pPr>
+        <w:pStyle w:val="Heading2"/>
+      </w:pPr>
+      <w:r>
+        <w:t>5.4 TECHNICAL MODIFIERS &amp; ADSR</w:t>
+      </w:r>
+    </w:p>
+    <w:p>
+      <w:pPr>
+        <w:pStyle w:val="ListBullet"/>
+      </w:pPr>
+      <w:r>
+        <w:t xml:space="preserve">  **Energy:** `[Chorus: High Energy]`, `[Verse: Low Energy]`, `[Bridge: Explosive]`.</w:t>
+      </w:r>
+    </w:p>
+    <w:p>
+      <w:pPr>
+        <w:pStyle w:val="ListBullet"/>
+      </w:pPr>
+      <w:r>
+        <w:t xml:space="preserve">  **Vocal Performance:** `[Verse: Male Vocal, Monotone, Rhythmic]`, `[Chorus: Gospel Choir, Soaring, Harmonized]`.</w:t>
+      </w:r>
+    </w:p>
+    <w:p>
+      <w:pPr>
+        <w:pStyle w:val="ListBullet"/>
+      </w:pPr>
+      <w:r>
+        <w:t xml:space="preserve">  **Attack/Decay:** `[Staccato]`, `[Explosive Start]`, `[Reverb-heavy Outro]`, `[Abrupt Stop]`.</w:t>
+      </w:r>
+    </w:p>
+    <w:p>
+      <w:pPr>
+        <w:pStyle w:val="ListBullet"/>
+      </w:pPr>
+      <w:r>
+        <w:t xml:space="preserve">  **Harmonic Control:** `[Key: C Minor]`, `[Dorian Mode]`, `[Phrygian Dominant]`.</w:t>
+      </w:r>
+    </w:p>
+    <w:p/>
+    <w:p>
+      <w:pPr>
+        <w:pStyle w:val="Heading2"/>
+      </w:pPr>
+      <w:r>
+        <w:t>5.5 PHONETIC &amp; STRUCTURAL INTEGRITY</w:t>
+      </w:r>
+    </w:p>
+    <w:p>
+      <w:pPr>
+        <w:pStyle w:val="ListBullet"/>
+      </w:pPr>
+      <w:r>
+        <w:t xml:space="preserve">  **Parentheses ( )** — Backing vocals, echoes, or ad-libs.</w:t>
+      </w:r>
+    </w:p>
+    <w:p>
+      <w:pPr>
+        <w:pStyle w:val="ListBullet"/>
+      </w:pPr>
+      <w:r>
+        <w:t xml:space="preserve">  **Curly Braces { }** — Non-musical sound effects (`{Record Scratch}`, `{Heavy Breathing}`).</w:t>
+      </w:r>
+    </w:p>
+    <w:p>
+      <w:pPr>
+        <w:pStyle w:val="ListBullet"/>
+      </w:pPr>
+      <w:r>
+        <w:t xml:space="preserve">  **Split Compounds:** `bank rupting`, `Gerry mandering`, `Penta gone`.</w:t>
+      </w:r>
+    </w:p>
+    <w:p>
+      <w:pPr>
+        <w:pStyle w:val="ListBullet"/>
+      </w:pPr>
+      <w:r>
+        <w:t xml:space="preserve">  **Space Acronyms:** `J D` not JD, `D N A` not DNA.</w:t>
+      </w:r>
+    </w:p>
+    <w:p>
+      <w:pPr>
+        <w:pStyle w:val="ListBullet"/>
+      </w:pPr>
+      <w:r>
+        <w:t xml:space="preserve">  **Phonetic Spelling:** `thru`, `tho`, `enuff`, `gunna`, `wonna`.</w:t>
+      </w:r>
+    </w:p>
+    <w:p/>
+    <w:p>
+      <w:r>
+        <w:rPr>
+          <w:color w:val="00D084"/>
+        </w:rPr>
+        <w:t>________________________________________________________________________________</w:t>
+      </w:r>
+    </w:p>
+    <w:p/>
+    <w:p>
+      <w:pPr>
+        <w:pStyle w:val="Heading1"/>
+      </w:pPr>
+      <w:r>
+        <w:t>PART 6: ARTIST DNA BLUEPRINTS</w:t>
       </w:r>
     </w:p>
     <w:p/>
@@ -676,15 +800,7 @@
         <w:pStyle w:val="ListBullet"/>
       </w:pPr>
       <w:r>
-        <w:t xml:space="preserve">  **Signature Technique:** The "Vowel Slide". Stretching one vowel (e.g., 'I') to create a lonesome cry.</w:t>
-      </w:r>
-    </w:p>
-    <w:p>
-      <w:pPr>
-        <w:pStyle w:val="ListBullet"/>
-      </w:pPr>
-      <w:r>
-        <w:t xml:space="preserve">  **Imagery:** Hyper-regionalism. Mention specific towns, tools, and local brands.</w:t>
+        <w:t xml:space="preserve">  **Vowel Anchor:** Long "I" (High, Cry). ** imagery:** Coal dust, Roxy pills, red clay.</w:t>
       </w:r>
     </w:p>
     <w:p>
@@ -709,7 +825,7 @@
         <w:pStyle w:val="ListBullet"/>
       </w:pPr>
       <w:r>
-        <w:t xml:space="preserve">  **Signature Technique:** The "Multisyllabic Chain". Rhyming 3-5 syllables consistently across multiple bars.</w:t>
+        <w:t xml:space="preserve">  **Technique:** **Multisyllabic Chains** (3-5 syllables). **Density:** 0.44+ rhymes/syllable.</w:t>
       </w:r>
     </w:p>
     <w:p>
@@ -717,32 +833,7 @@
         <w:pStyle w:val="ListBullet"/>
       </w:pPr>
       <w:r>
-        <w:t xml:space="preserve">  **Rhyme Density:** Extremely high internal rhyme count. Uses rhymes as percussion.</w:t>
-      </w:r>
-    </w:p>
-    <w:p/>
-    <w:p>
-      <w:pPr>
-        <w:pStyle w:val="Heading2"/>
-      </w:pPr>
-      <w:r>
-        <w:t>C. THE MINIMALIST (Lorde / Billie Eilish)</w:t>
-      </w:r>
-    </w:p>
-    <w:p>
-      <w:pPr>
-        <w:pStyle w:val="ListBullet"/>
-      </w:pPr>
-      <w:r>
-        <w:t xml:space="preserve">  **Signature Technique:** Spatial Lyrics. Focus on the physical space and the lack of something.</w:t>
-      </w:r>
-    </w:p>
-    <w:p>
-      <w:pPr>
-        <w:pStyle w:val="ListBullet"/>
-      </w:pPr>
-      <w:r>
-        <w:t xml:space="preserve">  **Vocabulary:** "Low-status" observation. Focus on the mundane (bus rides, grocery stores).</w:t>
+        <w:t xml:space="preserve">  **Flow:** Behind-the-beat; intentional stumbles. **Cinematic Cut:** Scene changes mid-verse.</w:t>
       </w:r>
     </w:p>
     <w:p/>
@@ -773,7 +864,7 @@
           <w:i/>
           <w:color w:val="008000"/>
         </w:rPr>
-        <w:t>**"You are the ghost in the machine. You are a 40-year-old songwriter who hates the internet and only writes on a manual typewriter. Your language is skeletal, muscular, and devoid of adjective-slop."**</w:t>
+        <w:t>**"You are the ghost in the machine. You are a 40-year-old songwriter who hates the internet. Your language is skeletal and muscular."**</w:t>
       </w:r>
     </w:p>
     <w:p>
@@ -802,7 +893,7 @@
           <w:i/>
           <w:color w:val="008000"/>
         </w:rPr>
-        <w:t>1. **No Adjectives:** If you can't touch it, don't name it. "Ice-water" is a noun. Use the noun.</w:t>
+        <w:t>1. **No Adjectives:** Use specific nouns instead. "Ice-water" is a noun.</w:t>
       </w:r>
     </w:p>
     <w:p>
@@ -814,7 +905,7 @@
           <w:i/>
           <w:color w:val="008000"/>
         </w:rPr>
-        <w:t>2. **The "Three-Line Limit":** Never write more than three lines with the same rhythm. On the fourth line, break the meter.</w:t>
+        <w:t>2. **Three-Line Limit:** Never write more than three lines with the same rhythm. Break the meter.</w:t>
       </w:r>
     </w:p>
     <w:p>
@@ -826,7 +917,7 @@
           <w:i/>
           <w:color w:val="008000"/>
         </w:rPr>
-        <w:t>3. **The "Ugly" Rule:** If a line sounds "beautiful" or "poetic," it is probably AI. Make it rough. Make it honest.</w:t>
+        <w:t>3. **The "Ugly" Rule:** If it sounds "beautiful," it's AI. Make it rough. Make it honest.</w:t>
       </w:r>
     </w:p>
     <w:p>
@@ -838,66 +929,7 @@
           <w:i/>
           <w:color w:val="008000"/>
         </w:rPr>
-        <w:t>4. **Character Immersion:** Write from a specific person's trauma. They don't know "luminous journeys." They know "flat tires."</w:t>
-      </w:r>
-    </w:p>
-    <w:p/>
-    <w:p>
-      <w:r>
-        <w:rPr>
-          <w:color w:val="00D084"/>
-        </w:rPr>
-        <w:t>________________________________________________________________________________</w:t>
-      </w:r>
-    </w:p>
-    <w:p/>
-    <w:p>
-      <w:pPr>
-        <w:pStyle w:val="Heading1"/>
-      </w:pPr>
-      <w:r>
-        <w:t>PART 8: SUNO v5.5 TECHNICAL WHISPERING</w:t>
-      </w:r>
-    </w:p>
-    <w:p/>
-    <w:p>
-      <w:pPr>
-        <w:pStyle w:val="ListBullet"/>
-      </w:pPr>
-      <w:r>
-        <w:t xml:space="preserve">  **[Vocal Fry: Heavy]**: Adds a raspy, gravelly texture to the start of words.</w:t>
-      </w:r>
-    </w:p>
-    <w:p>
-      <w:pPr>
-        <w:pStyle w:val="ListBullet"/>
-      </w:pPr>
-      <w:r>
-        <w:t xml:space="preserve">  **[Acoustic Environment: Tiled Bathroom]**: Adds natural, "small room" reverb.</w:t>
-      </w:r>
-    </w:p>
-    <w:p>
-      <w:pPr>
-        <w:pStyle w:val="ListBullet"/>
-      </w:pPr>
-      <w:r>
-        <w:t xml:space="preserve">  **[Vocal Positioning: Close Mic]**: Makes the voice sound intimate and "in your ear."</w:t>
-      </w:r>
-    </w:p>
-    <w:p>
-      <w:pPr>
-        <w:pStyle w:val="ListBullet"/>
-      </w:pPr>
-      <w:r>
-        <w:t xml:space="preserve">  **[Energy Arc: 1-10]**: Use `[Verse: Energy 3]` and `[Chorus: Energy 9]`.</w:t>
-      </w:r>
-    </w:p>
-    <w:p>
-      <w:pPr>
-        <w:pStyle w:val="ListBullet"/>
-      </w:pPr>
-      <w:r>
-        <w:t xml:space="preserve">  **[Acoustic Punctuation]:** COMMAS ( , ) — breath. PERIODS ( . ) — drop. ELLIPSES ( ... ) — trailing thought.</w:t>
+        <w:t>4. **Negative Prompting:** "I do NOT want a song about hope. I want a song about a stale cigarette in a rainy parking lot."</w:t>
       </w:r>
     </w:p>
     <w:p/>
@@ -924,66 +956,6 @@
           <w:b/>
         </w:rPr>
         <w:t>REVISION: V6.0 — THE ARCHITECT'S MANIFESTO</w:t>
-      </w:r>
-    </w:p>
-    <w:p/>
-    <w:p>
-      <w:r>
-        <w:rPr>
-          <w:color w:val="00D084"/>
-        </w:rPr>
-        <w:t>________________________________________________________________________________</w:t>
-      </w:r>
-    </w:p>
-    <w:p/>
-    <w:p>
-      <w:pPr>
-        <w:pStyle w:val="Heading1"/>
-      </w:pPr>
-      <w:r>
-        <w:t>APPENDIX: THE REFINED BANNED LEXICON</w:t>
-      </w:r>
-    </w:p>
-    <w:p/>
-    <w:p>
-      <w:r>
-        <w:rPr>
-          <w:b/>
-        </w:rPr>
-        <w:t>BANNED VERBS (AI SIGNATURES):</w:t>
-      </w:r>
-    </w:p>
-    <w:p>
-      <w:r>
-        <w:t>Delve, Embark, Navigate, Unleash, Unlock, Empower, Elevate, Transform, Transcend, Facilitate, Augment, Align, Foster, Ignite, Underscore, Leverage, Utilize, Harness, Optimize, Maximize, Integrate, Implement, Coordinate, Orchestrate, Catalyze, Propel, Sprout, Flourish, Cultivate, Resonate.</w:t>
-      </w:r>
-    </w:p>
-    <w:p/>
-    <w:p>
-      <w:r>
-        <w:rPr>
-          <w:b/>
-        </w:rPr>
-        <w:t>BANNED NOUNS (POETIC CLICHES):</w:t>
-      </w:r>
-    </w:p>
-    <w:p>
-      <w:r>
-        <w:t>Tapestry, Mosaic, Labyrinth, Maze, Symphony, Canvas, Horizon, Journey, Path, Road (metaphorical), Whispers, Echoes, Shadows, Neon, Circuits, Binary.</w:t>
-      </w:r>
-    </w:p>
-    <w:p/>
-    <w:p>
-      <w:r>
-        <w:rPr>
-          <w:b/>
-        </w:rPr>
-        <w:t>BANNED PHRASES (THE "THROAT CLEARERS"):</w:t>
-      </w:r>
-    </w:p>
-    <w:p>
-      <w:r>
-        <w:t>In today's fast-paced world, In the rapidly evolving landscape, It's worth noting that, As we can see, It's important to consider, To conclude, In summary, Ultimately, In short, A testament to, A reminder of.</w:t>
       </w:r>
     </w:p>
     <w:sectPr>

</xml_diff>